<commit_message>
modify on Delete Product UC
</commit_message>
<xml_diff>
--- a/RequirementAnalysis/UCSpec/word/20235958_LeHoangKien_CUDProduct.docx
+++ b/RequirementAnalysis/UCSpec/word/20235958_LeHoangKien_CUDProduct.docx
@@ -100,21 +100,7 @@
         <w:rPr>
           <w:rFonts w:ascii="Times New Roman" w:hAnsi="Times New Roman" w:cs="Times New Roman"/>
         </w:rPr>
-        <w:t xml:space="preserve">his </w:t>
-      </w:r>
-      <w:proofErr w:type="gramStart"/>
-      <w:r>
-        <w:rPr>
-          <w:rFonts w:ascii="Times New Roman" w:hAnsi="Times New Roman" w:cs="Times New Roman"/>
-        </w:rPr>
-        <w:t>use</w:t>
-      </w:r>
-      <w:proofErr w:type="gramEnd"/>
-      <w:r>
-        <w:rPr>
-          <w:rFonts w:ascii="Times New Roman" w:hAnsi="Times New Roman" w:cs="Times New Roman"/>
-        </w:rPr>
-        <w:t xml:space="preserve"> case allows the Product </w:t>
+        <w:t xml:space="preserve">his use case allows the Product </w:t>
       </w:r>
       <w:r>
         <w:rPr>
@@ -430,21 +416,7 @@
         <w:rPr>
           <w:rFonts w:ascii="Times New Roman" w:hAnsi="Times New Roman" w:cs="Times New Roman"/>
         </w:rPr>
-        <w:t xml:space="preserve">Step 7: AIMS software saves the new product and displays a </w:t>
-      </w:r>
-      <w:proofErr w:type="gramStart"/>
-      <w:r>
-        <w:rPr>
-          <w:rFonts w:ascii="Times New Roman" w:hAnsi="Times New Roman" w:cs="Times New Roman"/>
-        </w:rPr>
-        <w:t>success</w:t>
-      </w:r>
-      <w:proofErr w:type="gramEnd"/>
-      <w:r>
-        <w:rPr>
-          <w:rFonts w:ascii="Times New Roman" w:hAnsi="Times New Roman" w:cs="Times New Roman"/>
-        </w:rPr>
-        <w:t xml:space="preserve"> message.</w:t>
+        <w:t>Step 7: AIMS software saves the new product and displays a success message.</w:t>
       </w:r>
       <w:r>
         <w:rPr>
@@ -507,15 +479,7 @@
         <w:t>Step 2:</w:t>
       </w:r>
       <w:r>
-        <w:t xml:space="preserve"> AIMS software retrieves and displays the current information </w:t>
-      </w:r>
-      <w:proofErr w:type="gramStart"/>
-      <w:r>
-        <w:t>of</w:t>
-      </w:r>
-      <w:proofErr w:type="gramEnd"/>
-      <w:r>
-        <w:t xml:space="preserve"> the product.</w:t>
+        <w:t xml:space="preserve"> AIMS software retrieves and displays the current information of the product.</w:t>
       </w:r>
       <w:r>
         <w:t xml:space="preserve"> </w:t>
@@ -675,13 +639,10 @@
         <w:t>Step 4:</w:t>
       </w:r>
       <w:r>
-        <w:t xml:space="preserve"> For products with </w:t>
-      </w:r>
-      <w:r>
-        <w:t>s</w:t>
-      </w:r>
-      <w:r>
-        <w:t>tock = 0, AIMS software permanently deletes them.</w:t>
+        <w:t xml:space="preserve"> </w:t>
+      </w:r>
+      <w:r>
+        <w:t>AIMS software deletes selected products.</w:t>
       </w:r>
     </w:p>
     <w:p>
@@ -690,28 +651,25 @@
         <w:ind w:left="720"/>
       </w:pPr>
       <w:r>
-        <w:t xml:space="preserve">Step 5: For products with </w:t>
-      </w:r>
-      <w:r>
-        <w:t>s</w:t>
-      </w:r>
-      <w:r>
-        <w:t>tock &gt; 0, AIMS software changes their status to "Deactivated".</w:t>
-      </w:r>
-    </w:p>
-    <w:p>
-      <w:pPr>
-        <w:pStyle w:val="NormalWeb"/>
-        <w:ind w:left="720"/>
-      </w:pPr>
-      <w:r>
         <w:rPr>
           <w:rFonts w:hAnsi="Symbol"/>
         </w:rPr>
-        <w:t>Step 6:</w:t>
-      </w:r>
-      <w:r>
-        <w:t xml:space="preserve"> AIMS software displays a summary of the action (number of products deleted vs. deactivated).</w:t>
+        <w:t xml:space="preserve">Step </w:t>
+      </w:r>
+      <w:r>
+        <w:rPr>
+          <w:rFonts w:hAnsi="Symbol"/>
+        </w:rPr>
+        <w:t>5</w:t>
+      </w:r>
+      <w:r>
+        <w:rPr>
+          <w:rFonts w:hAnsi="Symbol"/>
+        </w:rPr>
+        <w:t>:</w:t>
+      </w:r>
+      <w:r>
+        <w:t xml:space="preserve"> AIMS software displays a summary of the action (number of products deleted).</w:t>
       </w:r>
     </w:p>
     <w:p>
@@ -1270,7 +1228,6 @@
               <w:rPr>
                 <w:rFonts w:ascii="Times New Roman" w:hAnsi="Times New Roman" w:cs="Times New Roman"/>
               </w:rPr>
-              <w:lastRenderedPageBreak/>
               <w:t>4</w:t>
             </w:r>
           </w:p>
@@ -1315,31 +1272,35 @@
                 <w:sz w:val="20"/>
                 <w:szCs w:val="20"/>
               </w:rPr>
-              <w:t xml:space="preserve">Total deleted products </w:t>
-            </w:r>
-            <w:proofErr w:type="gramStart"/>
-            <w:r>
+              <w:t>Total deleted products of the day will exceed 20 after the process</w:t>
+            </w:r>
+          </w:p>
+        </w:tc>
+        <w:tc>
+          <w:tcPr>
+            <w:tcW w:w="2304" w:type="dxa"/>
+          </w:tcPr>
+          <w:p>
+            <w:pPr>
               <w:rPr>
                 <w:rFonts w:ascii="Times New Roman" w:hAnsi="Times New Roman" w:cs="Times New Roman"/>
                 <w:sz w:val="20"/>
                 <w:szCs w:val="20"/>
               </w:rPr>
-              <w:t>of</w:t>
-            </w:r>
-            <w:proofErr w:type="gramEnd"/>
+            </w:pPr>
             <w:r>
               <w:rPr>
                 <w:rFonts w:ascii="Times New Roman" w:hAnsi="Times New Roman" w:cs="Times New Roman"/>
                 <w:sz w:val="20"/>
                 <w:szCs w:val="20"/>
               </w:rPr>
-              <w:t xml:space="preserve"> the day will exceed 20 after the process</w:t>
-            </w:r>
-          </w:p>
-        </w:tc>
-        <w:tc>
-          <w:tcPr>
-            <w:tcW w:w="2304" w:type="dxa"/>
+              <w:t>AIMS software prevents the action and require to reduce the product to be deleted</w:t>
+            </w:r>
+          </w:p>
+        </w:tc>
+        <w:tc>
+          <w:tcPr>
+            <w:tcW w:w="1718" w:type="dxa"/>
           </w:tcPr>
           <w:p>
             <w:pPr>
@@ -1355,36 +1316,61 @@
                 <w:sz w:val="20"/>
                 <w:szCs w:val="20"/>
               </w:rPr>
-              <w:t xml:space="preserve">AIMS software prevents the action and require </w:t>
-            </w:r>
-            <w:proofErr w:type="gramStart"/>
-            <w:r>
+              <w:t>At step 1 (Delete)</w:t>
+            </w:r>
+          </w:p>
+        </w:tc>
+      </w:tr>
+      <w:tr>
+        <w:tc>
+          <w:tcPr>
+            <w:tcW w:w="510" w:type="dxa"/>
+          </w:tcPr>
+          <w:p>
+            <w:pPr>
+              <w:rPr>
+                <w:rFonts w:ascii="Times New Roman" w:hAnsi="Times New Roman" w:cs="Times New Roman"/>
+              </w:rPr>
+            </w:pPr>
+            <w:r>
+              <w:rPr>
+                <w:rFonts w:ascii="Times New Roman" w:hAnsi="Times New Roman" w:cs="Times New Roman"/>
+              </w:rPr>
+              <w:lastRenderedPageBreak/>
+              <w:t>5</w:t>
+            </w:r>
+          </w:p>
+        </w:tc>
+        <w:tc>
+          <w:tcPr>
+            <w:tcW w:w="1920" w:type="dxa"/>
+          </w:tcPr>
+          <w:p>
+            <w:pPr>
               <w:rPr>
                 <w:rFonts w:ascii="Times New Roman" w:hAnsi="Times New Roman" w:cs="Times New Roman"/>
                 <w:sz w:val="20"/>
                 <w:szCs w:val="20"/>
               </w:rPr>
-              <w:t>to reduce</w:t>
-            </w:r>
-            <w:proofErr w:type="gramEnd"/>
+            </w:pPr>
             <w:r>
               <w:rPr>
                 <w:rFonts w:ascii="Times New Roman" w:hAnsi="Times New Roman" w:cs="Times New Roman"/>
                 <w:sz w:val="20"/>
                 <w:szCs w:val="20"/>
               </w:rPr>
-              <w:t xml:space="preserve"> the product to be deleted</w:t>
-            </w:r>
-          </w:p>
-        </w:tc>
-        <w:tc>
-          <w:tcPr>
-            <w:tcW w:w="1718" w:type="dxa"/>
-          </w:tcPr>
-          <w:p>
-            <w:pPr>
-              <w:rPr>
-                <w:rFonts w:ascii="Times New Roman" w:hAnsi="Times New Roman" w:cs="Times New Roman" w:hint="eastAsia"/>
+              <w:t>At step 3 (Delete)</w:t>
+            </w:r>
+          </w:p>
+        </w:tc>
+        <w:tc>
+          <w:tcPr>
+            <w:tcW w:w="2548" w:type="dxa"/>
+          </w:tcPr>
+          <w:p>
+            <w:pPr>
+              <w:rPr>
+                <w:rFonts w:ascii="Times New Roman" w:hAnsi="Times New Roman" w:cs="Times New Roman"/>
                 <w:sz w:val="20"/>
                 <w:szCs w:val="20"/>
               </w:rPr>
@@ -1395,7 +1381,159 @@
                 <w:sz w:val="20"/>
                 <w:szCs w:val="20"/>
               </w:rPr>
-              <w:t>At step 1 (Delete)</w:t>
+              <w:t>Exist products in the deletion list that have stock &gt; 0</w:t>
+            </w:r>
+          </w:p>
+        </w:tc>
+        <w:tc>
+          <w:tcPr>
+            <w:tcW w:w="2304" w:type="dxa"/>
+          </w:tcPr>
+          <w:p>
+            <w:pPr>
+              <w:rPr>
+                <w:rFonts w:ascii="Times New Roman" w:hAnsi="Times New Roman" w:cs="Times New Roman"/>
+                <w:sz w:val="20"/>
+                <w:szCs w:val="20"/>
+              </w:rPr>
+            </w:pPr>
+            <w:r>
+              <w:rPr>
+                <w:rFonts w:ascii="Times New Roman" w:hAnsi="Times New Roman" w:cs="Times New Roman"/>
+                <w:sz w:val="20"/>
+                <w:szCs w:val="20"/>
+              </w:rPr>
+              <w:t>AIMS software deactivates those products and includes number of deactivated products in the summary</w:t>
+            </w:r>
+          </w:p>
+        </w:tc>
+        <w:tc>
+          <w:tcPr>
+            <w:tcW w:w="1718" w:type="dxa"/>
+          </w:tcPr>
+          <w:p>
+            <w:pPr>
+              <w:rPr>
+                <w:rFonts w:ascii="Times New Roman" w:hAnsi="Times New Roman" w:cs="Times New Roman"/>
+                <w:sz w:val="20"/>
+                <w:szCs w:val="20"/>
+              </w:rPr>
+            </w:pPr>
+            <w:r>
+              <w:rPr>
+                <w:rFonts w:ascii="Times New Roman" w:hAnsi="Times New Roman" w:cs="Times New Roman"/>
+                <w:sz w:val="20"/>
+                <w:szCs w:val="20"/>
+              </w:rPr>
+              <w:t>At step 5 (Delete)</w:t>
+            </w:r>
+          </w:p>
+        </w:tc>
+      </w:tr>
+      <w:tr>
+        <w:tc>
+          <w:tcPr>
+            <w:tcW w:w="510" w:type="dxa"/>
+          </w:tcPr>
+          <w:p>
+            <w:pPr>
+              <w:rPr>
+                <w:rFonts w:ascii="Times New Roman" w:hAnsi="Times New Roman" w:cs="Times New Roman"/>
+              </w:rPr>
+            </w:pPr>
+            <w:r>
+              <w:rPr>
+                <w:rFonts w:ascii="Times New Roman" w:hAnsi="Times New Roman" w:cs="Times New Roman"/>
+              </w:rPr>
+              <w:t>6</w:t>
+            </w:r>
+          </w:p>
+        </w:tc>
+        <w:tc>
+          <w:tcPr>
+            <w:tcW w:w="1920" w:type="dxa"/>
+          </w:tcPr>
+          <w:p>
+            <w:pPr>
+              <w:rPr>
+                <w:rFonts w:ascii="Times New Roman" w:hAnsi="Times New Roman" w:cs="Times New Roman"/>
+                <w:sz w:val="20"/>
+                <w:szCs w:val="20"/>
+              </w:rPr>
+            </w:pPr>
+            <w:r>
+              <w:rPr>
+                <w:rFonts w:ascii="Times New Roman" w:hAnsi="Times New Roman" w:cs="Times New Roman"/>
+                <w:sz w:val="20"/>
+                <w:szCs w:val="20"/>
+              </w:rPr>
+              <w:t>At any step</w:t>
+            </w:r>
+          </w:p>
+        </w:tc>
+        <w:tc>
+          <w:tcPr>
+            <w:tcW w:w="2548" w:type="dxa"/>
+          </w:tcPr>
+          <w:p>
+            <w:pPr>
+              <w:rPr>
+                <w:rFonts w:ascii="Times New Roman" w:hAnsi="Times New Roman" w:cs="Times New Roman"/>
+                <w:sz w:val="20"/>
+                <w:szCs w:val="20"/>
+              </w:rPr>
+            </w:pPr>
+            <w:r>
+              <w:rPr>
+                <w:rFonts w:ascii="Times New Roman" w:hAnsi="Times New Roman" w:cs="Times New Roman"/>
+                <w:sz w:val="20"/>
+                <w:szCs w:val="20"/>
+              </w:rPr>
+              <w:t>Product manager wants to cancel the operation</w:t>
+            </w:r>
+          </w:p>
+        </w:tc>
+        <w:tc>
+          <w:tcPr>
+            <w:tcW w:w="2304" w:type="dxa"/>
+          </w:tcPr>
+          <w:p>
+            <w:pPr>
+              <w:rPr>
+                <w:rFonts w:ascii="Times New Roman" w:hAnsi="Times New Roman" w:cs="Times New Roman"/>
+                <w:sz w:val="20"/>
+                <w:szCs w:val="20"/>
+              </w:rPr>
+            </w:pPr>
+            <w:r>
+              <w:rPr>
+                <w:rFonts w:ascii="Times New Roman" w:hAnsi="Times New Roman" w:cs="Times New Roman"/>
+                <w:sz w:val="20"/>
+                <w:szCs w:val="20"/>
+              </w:rPr>
+              <w:t>AIMS software return to manager dashboard</w:t>
+            </w:r>
+          </w:p>
+        </w:tc>
+        <w:tc>
+          <w:tcPr>
+            <w:tcW w:w="1718" w:type="dxa"/>
+          </w:tcPr>
+          <w:p>
+            <w:pPr>
+              <w:rPr>
+                <w:rFonts w:ascii="Times New Roman" w:hAnsi="Times New Roman" w:cs="Times New Roman"/>
+                <w:sz w:val="20"/>
+                <w:szCs w:val="20"/>
+              </w:rPr>
+            </w:pPr>
+            <w:r>
+              <w:rPr>
+                <w:rFonts w:ascii="Times New Roman" w:hAnsi="Times New Roman" w:cs="Times New Roman"/>
+                <w:sz w:val="20"/>
+                <w:szCs w:val="20"/>
+              </w:rPr>
+              <w:t>Use case ends</w:t>
             </w:r>
           </w:p>
         </w:tc>
@@ -3476,6 +3614,7 @@
               <w:rPr>
                 <w:rFonts w:ascii="Times New Roman" w:hAnsi="Times New Roman" w:cs="Times New Roman"/>
               </w:rPr>
+              <w:lastRenderedPageBreak/>
               <w:t>3</w:t>
             </w:r>
           </w:p>
@@ -3636,7 +3775,6 @@
               <w:rPr>
                 <w:rFonts w:ascii="Times New Roman" w:hAnsi="Times New Roman" w:cs="Times New Roman"/>
               </w:rPr>
-              <w:lastRenderedPageBreak/>
               <w:t>5</w:t>
             </w:r>
           </w:p>
@@ -5711,28 +5849,14 @@
               <w:rPr>
                 <w:rFonts w:ascii="Times New Roman" w:hAnsi="Times New Roman" w:cs="Times New Roman"/>
               </w:rPr>
-              <w:t>Data field to be modified (</w:t>
-            </w:r>
-            <w:proofErr w:type="gramStart"/>
-            <w:r>
-              <w:rPr>
-                <w:rFonts w:ascii="Times New Roman" w:hAnsi="Times New Roman" w:cs="Times New Roman"/>
-              </w:rPr>
-              <w:t>similar to</w:t>
-            </w:r>
-            <w:proofErr w:type="gramEnd"/>
-            <w:r>
-              <w:rPr>
-                <w:rFonts w:ascii="Times New Roman" w:hAnsi="Times New Roman" w:cs="Times New Roman"/>
-              </w:rPr>
-              <w:t xml:space="preserve"> data meant for </w:t>
+              <w:t xml:space="preserve">Data field to be modified (similar to data </w:t>
             </w:r>
             <w:r>
               <w:rPr>
                 <w:rFonts w:ascii="Times New Roman" w:hAnsi="Times New Roman" w:cs="Times New Roman"/>
               </w:rPr>
               <w:lastRenderedPageBreak/>
-              <w:t>creating product)</w:t>
+              <w:t>meant for creating product)</w:t>
             </w:r>
           </w:p>
         </w:tc>
@@ -6577,14 +6701,12 @@
               </w:rPr>
               <w:t xml:space="preserve"> </w:t>
             </w:r>
-            <w:proofErr w:type="gramStart"/>
             <w:r>
               <w:rPr>
                 <w:rFonts w:ascii="Times New Roman" w:hAnsi="Times New Roman" w:cs="Times New Roman"/>
               </w:rPr>
               <w:t>separator</w:t>
             </w:r>
-            <w:proofErr w:type="gramEnd"/>
           </w:p>
           <w:p>
             <w:pPr>
@@ -6735,14 +6857,12 @@
               </w:rPr>
               <w:t xml:space="preserve"> </w:t>
             </w:r>
-            <w:proofErr w:type="gramStart"/>
             <w:r>
               <w:rPr>
                 <w:rFonts w:ascii="Times New Roman" w:hAnsi="Times New Roman" w:cs="Times New Roman"/>
               </w:rPr>
               <w:t>separator</w:t>
             </w:r>
-            <w:proofErr w:type="gramEnd"/>
           </w:p>
           <w:p>
             <w:pPr>
@@ -7294,6 +7414,7 @@
           <w:sz w:val="20"/>
           <w:szCs w:val="20"/>
         </w:rPr>
+        <w:lastRenderedPageBreak/>
         <w:t xml:space="preserve">Table </w:t>
       </w:r>
       <w:r>
@@ -9623,6 +9744,7 @@
           <w:b/>
           <w:bCs/>
         </w:rPr>
+        <w:lastRenderedPageBreak/>
         <w:t>Postcondition</w:t>
       </w:r>
       <w:r>
@@ -9657,7 +9779,6 @@
         <w:rPr>
           <w:rFonts w:ascii="Times New Roman" w:hAnsi="Times New Roman" w:cs="Times New Roman"/>
         </w:rPr>
-        <w:lastRenderedPageBreak/>
         <w:t>Successful Create/Update: The product database is updated, and changes are reflected in the system.</w:t>
       </w:r>
     </w:p>
@@ -11209,7 +11330,6 @@
     <w:name w:val="Normal (Web)"/>
     <w:basedOn w:val="Normal"/>
     <w:uiPriority w:val="99"/>
-    <w:semiHidden/>
     <w:unhideWhenUsed/>
     <w:rsid w:val="006465F7"/>
     <w:pPr>

</xml_diff>